<commit_message>
TS5 looks good praise King Jesus Christ our LORD
</commit_message>
<xml_diff>
--- a/41TS Tehnologiji stvorennja program/5/TS_Onyshchenko_KNT-122_19_PR5.docx
+++ b/41TS Tehnologiji stvorennja program/5/TS_Onyshchenko_KNT-122_19_PR5.docx
@@ -554,19 +554,7 @@
         <w:rPr>
           <w:lang w:val="uk-UA"/>
         </w:rPr>
-        <w:t xml:space="preserve">Завдання на роботу зі сторінки </w:t>
-      </w:r>
-      <w:r>
-        <w:rPr>
-          <w:lang w:val="uk-UA"/>
-        </w:rPr>
-        <w:t>63</w:t>
-      </w:r>
-      <w:r>
-        <w:rPr>
-          <w:lang w:val="uk-UA"/>
-        </w:rPr>
-        <w:t>:</w:t>
+        <w:t>Завдання на роботу зі сторінки 63:</w:t>
       </w:r>
     </w:p>
     <w:p>
@@ -666,11 +654,7 @@
       </w:pPr>
       <w:r>
         <w:rPr/>
-        <w:t>Р</w:t>
-      </w:r>
-      <w:r>
-        <w:rPr/>
-        <w:t>озробити основні (або статичні) сторінки вебзастосунку.</w:t>
+        <w:t>Розробити основні (або статичні) сторінки вебзастосунку.</w:t>
       </w:r>
     </w:p>
     <w:p>
@@ -726,6 +710,274 @@
           <w:lang w:val="uk-UA"/>
         </w:rPr>
         <w:t>Структура вебзастосунку, що реалізує систему</w:t>
+      </w:r>
+    </w:p>
+    <w:p>
+      <w:pPr>
+        <w:pStyle w:val="p1"/>
+        <w:bidi w:val="0"/>
+        <w:rPr>
+          <w:lang w:val="uk-UA"/>
+        </w:rPr>
+      </w:pPr>
+      <w:r>
+        <w:rPr>
+          <w:lang w:val="uk-UA"/>
+        </w:rPr>
+      </w:r>
+    </w:p>
+    <w:p>
+      <w:pPr>
+        <w:pStyle w:val="p1"/>
+        <w:bidi w:val="0"/>
+        <w:rPr>
+          <w:lang w:val="uk-UA"/>
+        </w:rPr>
+      </w:pPr>
+      <w:r>
+        <w:rPr>
+          <w:lang w:val="uk-UA"/>
+        </w:rPr>
+        <w:t>Структура вебзастосунку наступна:</w:t>
+      </w:r>
+    </w:p>
+    <w:p>
+      <w:pPr>
+        <w:pStyle w:val="p1"/>
+        <w:bidi w:val="0"/>
+        <w:rPr>
+          <w:lang w:val="uk-UA"/>
+        </w:rPr>
+      </w:pPr>
+      <w:r>
+        <w:rPr>
+          <w:lang w:val="uk-UA"/>
+        </w:rPr>
+      </w:r>
+    </w:p>
+    <w:p>
+      <w:pPr>
+        <w:pStyle w:val="code1"/>
+        <w:rPr/>
+      </w:pPr>
+      <w:r>
+        <w:rPr/>
+        <w:t>app/</w:t>
+      </w:r>
+    </w:p>
+    <w:p>
+      <w:pPr>
+        <w:pStyle w:val="code1"/>
+        <w:rPr/>
+      </w:pPr>
+      <w:r>
+        <w:rPr/>
+        <w:t xml:space="preserve">├── </w:t>
+      </w:r>
+      <w:r>
+        <w:rPr/>
+        <w:t>backend/</w:t>
+      </w:r>
+    </w:p>
+    <w:p>
+      <w:pPr>
+        <w:pStyle w:val="code1"/>
+        <w:rPr/>
+      </w:pPr>
+      <w:r>
+        <w:rPr/>
+        <w:t xml:space="preserve">│   ├── </w:t>
+      </w:r>
+      <w:r>
+        <w:rPr/>
+        <w:t>settings.py</w:t>
+      </w:r>
+    </w:p>
+    <w:p>
+      <w:pPr>
+        <w:pStyle w:val="code1"/>
+        <w:rPr/>
+      </w:pPr>
+      <w:r>
+        <w:rPr/>
+        <w:t xml:space="preserve">│   └── </w:t>
+      </w:r>
+      <w:r>
+        <w:rPr/>
+        <w:t>urls.py</w:t>
+      </w:r>
+    </w:p>
+    <w:p>
+      <w:pPr>
+        <w:pStyle w:val="code1"/>
+        <w:rPr/>
+      </w:pPr>
+      <w:r>
+        <w:rPr/>
+        <w:t xml:space="preserve">└── </w:t>
+      </w:r>
+      <w:r>
+        <w:rPr/>
+        <w:t>frontend/</w:t>
+      </w:r>
+    </w:p>
+    <w:p>
+      <w:pPr>
+        <w:pStyle w:val="code1"/>
+        <w:rPr/>
+      </w:pPr>
+      <w:r>
+        <w:rPr/>
+        <w:t xml:space="preserve">    ├── </w:t>
+      </w:r>
+      <w:r>
+        <w:rPr/>
+        <w:t>templates/</w:t>
+      </w:r>
+    </w:p>
+    <w:p>
+      <w:pPr>
+        <w:pStyle w:val="code1"/>
+        <w:rPr/>
+      </w:pPr>
+      <w:r>
+        <w:rPr/>
+        <w:t xml:space="preserve">    │   ├── </w:t>
+      </w:r>
+      <w:r>
+        <w:rPr/>
+        <w:t>base.html</w:t>
+      </w:r>
+    </w:p>
+    <w:p>
+      <w:pPr>
+        <w:pStyle w:val="code1"/>
+        <w:rPr/>
+      </w:pPr>
+      <w:r>
+        <w:rPr/>
+        <w:t xml:space="preserve">    │   ├── </w:t>
+      </w:r>
+      <w:r>
+        <w:rPr/>
+        <w:t>index.html</w:t>
+      </w:r>
+    </w:p>
+    <w:p>
+      <w:pPr>
+        <w:pStyle w:val="code1"/>
+        <w:rPr/>
+      </w:pPr>
+      <w:r>
+        <w:rPr/>
+        <w:t xml:space="preserve">    │   └── </w:t>
+      </w:r>
+      <w:r>
+        <w:rPr/>
+        <w:t>verses.html</w:t>
+      </w:r>
+    </w:p>
+    <w:p>
+      <w:pPr>
+        <w:pStyle w:val="code1"/>
+        <w:rPr/>
+      </w:pPr>
+      <w:r>
+        <w:rPr/>
+        <w:t xml:space="preserve">    ├── </w:t>
+      </w:r>
+      <w:r>
+        <w:rPr/>
+        <w:t>consts.py</w:t>
+      </w:r>
+    </w:p>
+    <w:p>
+      <w:pPr>
+        <w:pStyle w:val="code1"/>
+        <w:rPr/>
+      </w:pPr>
+      <w:r>
+        <w:rPr/>
+        <w:t xml:space="preserve">    ├── </w:t>
+      </w:r>
+      <w:r>
+        <w:rPr/>
+        <w:t>urls.py</w:t>
+      </w:r>
+    </w:p>
+    <w:p>
+      <w:pPr>
+        <w:pStyle w:val="code1"/>
+        <w:rPr/>
+      </w:pPr>
+      <w:r>
+        <w:rPr/>
+        <w:t xml:space="preserve">    └── </w:t>
+      </w:r>
+      <w:r>
+        <w:rPr/>
+        <w:t>views.py</w:t>
+      </w:r>
+    </w:p>
+    <w:p>
+      <w:pPr>
+        <w:pStyle w:val="p1"/>
+        <w:bidi w:val="0"/>
+        <w:rPr>
+          <w:lang w:val="uk-UA"/>
+        </w:rPr>
+      </w:pPr>
+      <w:r>
+        <w:rPr>
+          <w:lang w:val="uk-UA"/>
+        </w:rPr>
+      </w:r>
+    </w:p>
+    <w:p>
+      <w:pPr>
+        <w:pStyle w:val="p1"/>
+        <w:bidi w:val="0"/>
+        <w:rPr>
+          <w:lang w:val="en-US"/>
+        </w:rPr>
+      </w:pPr>
+      <w:r>
+        <w:rPr>
+          <w:lang w:val="uk-UA"/>
+        </w:rPr>
+        <w:t xml:space="preserve">Основний функціонал зосереджено у </w:t>
+      </w:r>
+      <w:r>
+        <w:rPr>
+          <w:lang w:val="en-US"/>
+        </w:rPr>
+        <w:t xml:space="preserve">frontend/templates </w:t>
+      </w:r>
+      <w:r>
+        <w:rPr>
+          <w:lang w:val="uk-UA"/>
+        </w:rPr>
+        <w:t xml:space="preserve">та </w:t>
+      </w:r>
+      <w:r>
+        <w:rPr>
+          <w:lang w:val="en-US"/>
+        </w:rPr>
+        <w:t>frontend/views.</w:t>
+      </w:r>
+    </w:p>
+    <w:p>
+      <w:pPr>
+        <w:pStyle w:val="p1"/>
+        <w:bidi w:val="0"/>
+        <w:rPr>
+          <w:lang w:val="uk-UA"/>
+        </w:rPr>
+      </w:pPr>
+      <w:r>
+        <w:rPr>
+          <w:lang w:val="uk-UA"/>
+        </w:rPr>
       </w:r>
     </w:p>
     <w:p>
@@ -1737,15 +1989,15 @@
       <w:rFonts w:cs="Lucida Sans"/>
     </w:rPr>
   </w:style>
+  <w:style w:type="paragraph" w:styleId="Style18">
+    <w:name w:val="Верхній і нижній колонтитули"/>
+    <w:basedOn w:val="Normal"/>
+    <w:qFormat/>
+    <w:pPr/>
+    <w:rPr/>
+  </w:style>
   <w:style w:type="paragraph" w:styleId="user2">
     <w:name w:val="Верхній і нижній колонтитули (user)"/>
-    <w:basedOn w:val="Normal"/>
-    <w:qFormat/>
-    <w:pPr/>
-    <w:rPr/>
-  </w:style>
-  <w:style w:type="paragraph" w:styleId="Style18">
-    <w:name w:val="Верхній і нижній колонтитули"/>
     <w:basedOn w:val="Normal"/>
     <w:qFormat/>
     <w:pPr/>

</xml_diff>